<commit_message>
Epic 1 - Andrii Sukach
</commit_message>
<xml_diff>
--- a/ai_14/andrii_sukach/epic_1/epic_1_report_andrii_sukach.docx
+++ b/ai_14/andrii_sukach/epic_1/epic_1_report_andrii_sukach.docx
@@ -106,12 +106,12 @@
             <wp:extent cx="2727722" cy="2571750"/>
             <wp:effectExtent b="0" l="0" r="0" t="0"/>
             <wp:wrapNone/>
-            <wp:docPr descr="A blue and white logo&#10;&#10;Description automatically generated" id="46" name="image4.jpg"/>
+            <wp:docPr descr="A blue and white logo&#10;&#10;Description automatically generated" id="44" name="image2.jpg"/>
             <a:graphic>
               <a:graphicData uri="http://schemas.openxmlformats.org/drawingml/2006/picture">
                 <pic:pic>
                   <pic:nvPicPr>
-                    <pic:cNvPr descr="A blue and white logo&#10;&#10;Description automatically generated" id="0" name="image4.jpg"/>
+                    <pic:cNvPr descr="A blue and white logo&#10;&#10;Description automatically generated" id="0" name="image2.jpg"/>
                     <pic:cNvPicPr preferRelativeResize="0"/>
                   </pic:nvPicPr>
                   <pic:blipFill>
@@ -911,7 +911,7 @@
       <w:pPr>
         <w:numPr>
           <w:ilvl w:val="0"/>
-          <w:numId w:val="14"/>
+          <w:numId w:val="13"/>
         </w:numPr>
         <w:spacing w:line="276" w:lineRule="auto"/>
         <w:ind w:left="720" w:hanging="360"/>
@@ -936,7 +936,7 @@
       <w:pPr>
         <w:numPr>
           <w:ilvl w:val="0"/>
-          <w:numId w:val="11"/>
+          <w:numId w:val="10"/>
         </w:numPr>
         <w:spacing w:line="240" w:lineRule="auto"/>
         <w:ind w:left="720" w:hanging="360"/>
@@ -966,7 +966,7 @@
       <w:pPr>
         <w:numPr>
           <w:ilvl w:val="0"/>
-          <w:numId w:val="11"/>
+          <w:numId w:val="10"/>
         </w:numPr>
         <w:spacing w:line="240" w:lineRule="auto"/>
         <w:ind w:left="720" w:hanging="360"/>
@@ -996,7 +996,7 @@
       <w:pPr>
         <w:numPr>
           <w:ilvl w:val="0"/>
-          <w:numId w:val="11"/>
+          <w:numId w:val="10"/>
         </w:numPr>
         <w:spacing w:line="240" w:lineRule="auto"/>
         <w:ind w:left="720" w:hanging="360"/>
@@ -1026,7 +1026,7 @@
       <w:pPr>
         <w:numPr>
           <w:ilvl w:val="0"/>
-          <w:numId w:val="11"/>
+          <w:numId w:val="10"/>
         </w:numPr>
         <w:spacing w:line="240" w:lineRule="auto"/>
         <w:ind w:left="720" w:hanging="360"/>
@@ -1056,7 +1056,7 @@
       <w:pPr>
         <w:numPr>
           <w:ilvl w:val="0"/>
-          <w:numId w:val="11"/>
+          <w:numId w:val="10"/>
         </w:numPr>
         <w:spacing w:line="240" w:lineRule="auto"/>
         <w:ind w:left="720" w:hanging="360"/>
@@ -1086,7 +1086,7 @@
       <w:pPr>
         <w:numPr>
           <w:ilvl w:val="0"/>
-          <w:numId w:val="11"/>
+          <w:numId w:val="10"/>
         </w:numPr>
         <w:spacing w:line="240" w:lineRule="auto"/>
         <w:ind w:left="720" w:hanging="360"/>
@@ -1116,7 +1116,7 @@
       <w:pPr>
         <w:numPr>
           <w:ilvl w:val="0"/>
-          <w:numId w:val="11"/>
+          <w:numId w:val="10"/>
         </w:numPr>
         <w:spacing w:line="240" w:lineRule="auto"/>
         <w:ind w:left="720" w:hanging="360"/>
@@ -1163,7 +1163,7 @@
       <w:pPr>
         <w:numPr>
           <w:ilvl w:val="0"/>
-          <w:numId w:val="14"/>
+          <w:numId w:val="13"/>
         </w:numPr>
         <w:spacing w:line="276" w:lineRule="auto"/>
         <w:ind w:left="720" w:hanging="360"/>
@@ -1188,7 +1188,7 @@
       <w:pPr>
         <w:numPr>
           <w:ilvl w:val="0"/>
-          <w:numId w:val="11"/>
+          <w:numId w:val="10"/>
         </w:numPr>
         <w:spacing w:line="240" w:lineRule="auto"/>
         <w:ind w:left="720" w:hanging="360"/>
@@ -1213,7 +1213,7 @@
       <w:pPr>
         <w:numPr>
           <w:ilvl w:val="1"/>
-          <w:numId w:val="11"/>
+          <w:numId w:val="10"/>
         </w:numPr>
         <w:spacing w:line="240" w:lineRule="auto"/>
         <w:ind w:left="1440" w:hanging="360"/>
@@ -1238,7 +1238,7 @@
       <w:pPr>
         <w:numPr>
           <w:ilvl w:val="2"/>
-          <w:numId w:val="11"/>
+          <w:numId w:val="10"/>
         </w:numPr>
         <w:ind w:left="2160" w:hanging="360"/>
         <w:jc w:val="both"/>
@@ -1262,7 +1262,7 @@
       <w:pPr>
         <w:numPr>
           <w:ilvl w:val="2"/>
-          <w:numId w:val="11"/>
+          <w:numId w:val="10"/>
         </w:numPr>
         <w:ind w:left="2160" w:hanging="360"/>
         <w:jc w:val="both"/>
@@ -1327,7 +1327,7 @@
       <w:pPr>
         <w:numPr>
           <w:ilvl w:val="1"/>
-          <w:numId w:val="11"/>
+          <w:numId w:val="10"/>
         </w:numPr>
         <w:spacing w:line="240" w:lineRule="auto"/>
         <w:ind w:left="1440" w:hanging="360"/>
@@ -1352,7 +1352,7 @@
       <w:pPr>
         <w:numPr>
           <w:ilvl w:val="2"/>
-          <w:numId w:val="11"/>
+          <w:numId w:val="10"/>
         </w:numPr>
         <w:ind w:left="2160" w:hanging="360"/>
         <w:jc w:val="both"/>
@@ -1376,7 +1376,7 @@
       <w:pPr>
         <w:numPr>
           <w:ilvl w:val="1"/>
-          <w:numId w:val="11"/>
+          <w:numId w:val="10"/>
         </w:numPr>
         <w:spacing w:line="240" w:lineRule="auto"/>
         <w:ind w:left="1440" w:hanging="360"/>
@@ -1401,7 +1401,7 @@
       <w:pPr>
         <w:numPr>
           <w:ilvl w:val="1"/>
-          <w:numId w:val="11"/>
+          <w:numId w:val="10"/>
         </w:numPr>
         <w:spacing w:line="240" w:lineRule="auto"/>
         <w:ind w:left="1440" w:hanging="360"/>
@@ -1426,7 +1426,7 @@
       <w:pPr>
         <w:numPr>
           <w:ilvl w:val="0"/>
-          <w:numId w:val="11"/>
+          <w:numId w:val="10"/>
         </w:numPr>
         <w:spacing w:line="240" w:lineRule="auto"/>
         <w:ind w:left="720" w:hanging="360"/>
@@ -1454,7 +1454,7 @@
       <w:pPr>
         <w:numPr>
           <w:ilvl w:val="0"/>
-          <w:numId w:val="11"/>
+          <w:numId w:val="10"/>
         </w:numPr>
         <w:spacing w:line="240" w:lineRule="auto"/>
         <w:ind w:left="720" w:hanging="360"/>
@@ -1479,7 +1479,7 @@
       <w:pPr>
         <w:numPr>
           <w:ilvl w:val="1"/>
-          <w:numId w:val="11"/>
+          <w:numId w:val="10"/>
         </w:numPr>
         <w:spacing w:line="240" w:lineRule="auto"/>
         <w:ind w:left="1440" w:hanging="360"/>
@@ -1504,7 +1504,7 @@
       <w:pPr>
         <w:numPr>
           <w:ilvl w:val="2"/>
-          <w:numId w:val="11"/>
+          <w:numId w:val="10"/>
         </w:numPr>
         <w:spacing w:line="240" w:lineRule="auto"/>
         <w:ind w:left="2160" w:hanging="360"/>
@@ -1529,7 +1529,7 @@
       <w:pPr>
         <w:numPr>
           <w:ilvl w:val="2"/>
-          <w:numId w:val="11"/>
+          <w:numId w:val="10"/>
         </w:numPr>
         <w:spacing w:line="240" w:lineRule="auto"/>
         <w:ind w:left="2160" w:hanging="360"/>
@@ -1567,7 +1567,7 @@
       <w:pPr>
         <w:numPr>
           <w:ilvl w:val="2"/>
-          <w:numId w:val="11"/>
+          <w:numId w:val="10"/>
         </w:numPr>
         <w:spacing w:line="240" w:lineRule="auto"/>
         <w:ind w:left="2160" w:hanging="360"/>
@@ -1592,7 +1592,7 @@
       <w:pPr>
         <w:numPr>
           <w:ilvl w:val="2"/>
-          <w:numId w:val="11"/>
+          <w:numId w:val="10"/>
         </w:numPr>
         <w:spacing w:line="240" w:lineRule="auto"/>
         <w:ind w:left="2160" w:hanging="360"/>
@@ -1635,7 +1635,7 @@
       <w:pPr>
         <w:numPr>
           <w:ilvl w:val="2"/>
-          <w:numId w:val="11"/>
+          <w:numId w:val="10"/>
         </w:numPr>
         <w:spacing w:line="240" w:lineRule="auto"/>
         <w:ind w:left="2160" w:hanging="360"/>
@@ -1669,7 +1669,7 @@
       <w:pPr>
         <w:numPr>
           <w:ilvl w:val="1"/>
-          <w:numId w:val="11"/>
+          <w:numId w:val="10"/>
         </w:numPr>
         <w:spacing w:line="240" w:lineRule="auto"/>
         <w:ind w:left="1440" w:hanging="360"/>
@@ -1694,7 +1694,7 @@
       <w:pPr>
         <w:numPr>
           <w:ilvl w:val="2"/>
-          <w:numId w:val="11"/>
+          <w:numId w:val="10"/>
         </w:numPr>
         <w:spacing w:line="240" w:lineRule="auto"/>
         <w:ind w:left="2160" w:hanging="360"/>
@@ -1719,7 +1719,7 @@
       <w:pPr>
         <w:numPr>
           <w:ilvl w:val="2"/>
-          <w:numId w:val="11"/>
+          <w:numId w:val="10"/>
         </w:numPr>
         <w:spacing w:line="240" w:lineRule="auto"/>
         <w:ind w:left="2160" w:hanging="360"/>
@@ -1744,7 +1744,7 @@
       <w:pPr>
         <w:numPr>
           <w:ilvl w:val="2"/>
-          <w:numId w:val="11"/>
+          <w:numId w:val="10"/>
         </w:numPr>
         <w:spacing w:line="240" w:lineRule="auto"/>
         <w:ind w:left="2160" w:hanging="360"/>
@@ -1769,7 +1769,7 @@
       <w:pPr>
         <w:numPr>
           <w:ilvl w:val="1"/>
-          <w:numId w:val="11"/>
+          <w:numId w:val="10"/>
         </w:numPr>
         <w:spacing w:line="240" w:lineRule="auto"/>
         <w:ind w:left="1440" w:hanging="360"/>
@@ -1794,7 +1794,7 @@
       <w:pPr>
         <w:numPr>
           <w:ilvl w:val="1"/>
-          <w:numId w:val="11"/>
+          <w:numId w:val="10"/>
         </w:numPr>
         <w:spacing w:line="240" w:lineRule="auto"/>
         <w:ind w:left="1440" w:hanging="360"/>
@@ -1819,7 +1819,7 @@
       <w:pPr>
         <w:numPr>
           <w:ilvl w:val="1"/>
-          <w:numId w:val="11"/>
+          <w:numId w:val="10"/>
         </w:numPr>
         <w:spacing w:line="240" w:lineRule="auto"/>
         <w:ind w:left="1440" w:hanging="360"/>
@@ -1844,7 +1844,7 @@
       <w:pPr>
         <w:numPr>
           <w:ilvl w:val="0"/>
-          <w:numId w:val="11"/>
+          <w:numId w:val="10"/>
         </w:numPr>
         <w:spacing w:line="240" w:lineRule="auto"/>
         <w:ind w:left="720" w:hanging="360"/>
@@ -1866,7 +1866,7 @@
       <w:pPr>
         <w:numPr>
           <w:ilvl w:val="0"/>
-          <w:numId w:val="11"/>
+          <w:numId w:val="10"/>
         </w:numPr>
         <w:spacing w:line="240" w:lineRule="auto"/>
         <w:ind w:left="720" w:hanging="360"/>
@@ -1891,7 +1891,7 @@
       <w:pPr>
         <w:numPr>
           <w:ilvl w:val="1"/>
-          <w:numId w:val="11"/>
+          <w:numId w:val="10"/>
         </w:numPr>
         <w:spacing w:line="240" w:lineRule="auto"/>
         <w:ind w:left="1440" w:hanging="360"/>
@@ -1916,7 +1916,7 @@
       <w:pPr>
         <w:numPr>
           <w:ilvl w:val="2"/>
-          <w:numId w:val="11"/>
+          <w:numId w:val="10"/>
         </w:numPr>
         <w:spacing w:line="240" w:lineRule="auto"/>
         <w:ind w:left="2160" w:hanging="360"/>
@@ -1941,7 +1941,7 @@
       <w:pPr>
         <w:numPr>
           <w:ilvl w:val="2"/>
-          <w:numId w:val="11"/>
+          <w:numId w:val="10"/>
         </w:numPr>
         <w:spacing w:line="240" w:lineRule="auto"/>
         <w:ind w:left="2160" w:hanging="360"/>
@@ -1966,7 +1966,7 @@
       <w:pPr>
         <w:numPr>
           <w:ilvl w:val="2"/>
-          <w:numId w:val="11"/>
+          <w:numId w:val="10"/>
         </w:numPr>
         <w:spacing w:line="240" w:lineRule="auto"/>
         <w:ind w:left="2160" w:hanging="360"/>
@@ -2000,7 +2000,7 @@
       <w:pPr>
         <w:numPr>
           <w:ilvl w:val="2"/>
-          <w:numId w:val="11"/>
+          <w:numId w:val="10"/>
         </w:numPr>
         <w:spacing w:line="240" w:lineRule="auto"/>
         <w:ind w:left="2160" w:hanging="360"/>
@@ -2034,7 +2034,7 @@
       <w:pPr>
         <w:numPr>
           <w:ilvl w:val="1"/>
-          <w:numId w:val="11"/>
+          <w:numId w:val="10"/>
         </w:numPr>
         <w:spacing w:line="240" w:lineRule="auto"/>
         <w:ind w:left="1440" w:hanging="360"/>
@@ -2059,7 +2059,7 @@
       <w:pPr>
         <w:numPr>
           <w:ilvl w:val="2"/>
-          <w:numId w:val="11"/>
+          <w:numId w:val="10"/>
         </w:numPr>
         <w:spacing w:line="240" w:lineRule="auto"/>
         <w:ind w:left="2160" w:hanging="360"/>
@@ -2084,7 +2084,7 @@
       <w:pPr>
         <w:numPr>
           <w:ilvl w:val="2"/>
-          <w:numId w:val="11"/>
+          <w:numId w:val="10"/>
         </w:numPr>
         <w:spacing w:line="240" w:lineRule="auto"/>
         <w:ind w:left="2160" w:hanging="360"/>
@@ -2109,7 +2109,7 @@
       <w:pPr>
         <w:numPr>
           <w:ilvl w:val="1"/>
-          <w:numId w:val="11"/>
+          <w:numId w:val="10"/>
         </w:numPr>
         <w:spacing w:line="240" w:lineRule="auto"/>
         <w:ind w:left="1440" w:hanging="360"/>
@@ -2134,7 +2134,7 @@
       <w:pPr>
         <w:numPr>
           <w:ilvl w:val="1"/>
-          <w:numId w:val="11"/>
+          <w:numId w:val="10"/>
         </w:numPr>
         <w:spacing w:line="240" w:lineRule="auto"/>
         <w:ind w:left="1440" w:hanging="360"/>
@@ -2159,7 +2159,7 @@
       <w:pPr>
         <w:numPr>
           <w:ilvl w:val="1"/>
-          <w:numId w:val="11"/>
+          <w:numId w:val="10"/>
         </w:numPr>
         <w:spacing w:line="240" w:lineRule="auto"/>
         <w:ind w:left="1440" w:hanging="360"/>
@@ -2183,7 +2183,7 @@
       <w:pPr>
         <w:numPr>
           <w:ilvl w:val="0"/>
-          <w:numId w:val="11"/>
+          <w:numId w:val="10"/>
         </w:numPr>
         <w:spacing w:line="240" w:lineRule="auto"/>
         <w:ind w:left="720" w:hanging="360"/>
@@ -2206,7 +2206,7 @@
       <w:pPr>
         <w:numPr>
           <w:ilvl w:val="1"/>
-          <w:numId w:val="11"/>
+          <w:numId w:val="10"/>
         </w:numPr>
         <w:spacing w:line="240" w:lineRule="auto"/>
         <w:ind w:left="1440" w:hanging="360"/>
@@ -2231,7 +2231,7 @@
       <w:pPr>
         <w:numPr>
           <w:ilvl w:val="2"/>
-          <w:numId w:val="11"/>
+          <w:numId w:val="10"/>
         </w:numPr>
         <w:spacing w:line="240" w:lineRule="auto"/>
         <w:ind w:left="2160" w:hanging="360"/>
@@ -2265,7 +2265,7 @@
       <w:pPr>
         <w:numPr>
           <w:ilvl w:val="2"/>
-          <w:numId w:val="11"/>
+          <w:numId w:val="10"/>
         </w:numPr>
         <w:spacing w:line="240" w:lineRule="auto"/>
         <w:ind w:left="2160" w:hanging="360"/>
@@ -2290,7 +2290,7 @@
       <w:pPr>
         <w:numPr>
           <w:ilvl w:val="2"/>
-          <w:numId w:val="11"/>
+          <w:numId w:val="10"/>
         </w:numPr>
         <w:spacing w:after="100" w:line="240" w:lineRule="auto"/>
         <w:ind w:left="2160" w:hanging="360"/>
@@ -2321,7 +2321,7 @@
       <w:pPr>
         <w:numPr>
           <w:ilvl w:val="2"/>
-          <w:numId w:val="11"/>
+          <w:numId w:val="10"/>
         </w:numPr>
         <w:spacing w:after="100" w:line="240" w:lineRule="auto"/>
         <w:ind w:left="2160" w:hanging="360"/>
@@ -2352,7 +2352,7 @@
       <w:pPr>
         <w:numPr>
           <w:ilvl w:val="2"/>
-          <w:numId w:val="11"/>
+          <w:numId w:val="10"/>
         </w:numPr>
         <w:spacing w:after="100" w:line="240" w:lineRule="auto"/>
         <w:ind w:left="2160" w:hanging="360"/>
@@ -2394,7 +2394,7 @@
       <w:pPr>
         <w:numPr>
           <w:ilvl w:val="1"/>
-          <w:numId w:val="11"/>
+          <w:numId w:val="10"/>
         </w:numPr>
         <w:spacing w:line="240" w:lineRule="auto"/>
         <w:ind w:left="1440" w:hanging="360"/>
@@ -2419,7 +2419,7 @@
       <w:pPr>
         <w:numPr>
           <w:ilvl w:val="2"/>
-          <w:numId w:val="11"/>
+          <w:numId w:val="10"/>
         </w:numPr>
         <w:spacing w:line="240" w:lineRule="auto"/>
         <w:ind w:left="2160" w:hanging="360"/>
@@ -2444,7 +2444,7 @@
       <w:pPr>
         <w:numPr>
           <w:ilvl w:val="2"/>
-          <w:numId w:val="11"/>
+          <w:numId w:val="10"/>
         </w:numPr>
         <w:spacing w:line="240" w:lineRule="auto"/>
         <w:ind w:left="2160" w:hanging="360"/>
@@ -2469,7 +2469,7 @@
       <w:pPr>
         <w:numPr>
           <w:ilvl w:val="2"/>
-          <w:numId w:val="11"/>
+          <w:numId w:val="10"/>
         </w:numPr>
         <w:spacing w:line="240" w:lineRule="auto"/>
         <w:ind w:left="2160" w:hanging="360"/>
@@ -2494,7 +2494,7 @@
       <w:pPr>
         <w:numPr>
           <w:ilvl w:val="2"/>
-          <w:numId w:val="11"/>
+          <w:numId w:val="10"/>
         </w:numPr>
         <w:spacing w:line="240" w:lineRule="auto"/>
         <w:ind w:left="2160" w:hanging="360"/>
@@ -2519,7 +2519,7 @@
       <w:pPr>
         <w:numPr>
           <w:ilvl w:val="1"/>
-          <w:numId w:val="11"/>
+          <w:numId w:val="10"/>
         </w:numPr>
         <w:spacing w:line="240" w:lineRule="auto"/>
         <w:ind w:left="1440" w:hanging="360"/>
@@ -2544,7 +2544,7 @@
       <w:pPr>
         <w:numPr>
           <w:ilvl w:val="1"/>
-          <w:numId w:val="11"/>
+          <w:numId w:val="10"/>
         </w:numPr>
         <w:spacing w:line="240" w:lineRule="auto"/>
         <w:ind w:left="1440" w:hanging="360"/>
@@ -2569,7 +2569,7 @@
       <w:pPr>
         <w:numPr>
           <w:ilvl w:val="1"/>
-          <w:numId w:val="11"/>
+          <w:numId w:val="10"/>
         </w:numPr>
         <w:spacing w:line="240" w:lineRule="auto"/>
         <w:ind w:left="1440" w:hanging="360"/>
@@ -2593,7 +2593,7 @@
       <w:pPr>
         <w:numPr>
           <w:ilvl w:val="0"/>
-          <w:numId w:val="11"/>
+          <w:numId w:val="10"/>
         </w:numPr>
         <w:spacing w:line="240" w:lineRule="auto"/>
         <w:ind w:left="720" w:hanging="360"/>
@@ -2616,7 +2616,7 @@
       <w:pPr>
         <w:numPr>
           <w:ilvl w:val="1"/>
-          <w:numId w:val="11"/>
+          <w:numId w:val="10"/>
         </w:numPr>
         <w:spacing w:line="240" w:lineRule="auto"/>
         <w:ind w:left="1440" w:hanging="360"/>
@@ -2641,7 +2641,7 @@
       <w:pPr>
         <w:numPr>
           <w:ilvl w:val="2"/>
-          <w:numId w:val="11"/>
+          <w:numId w:val="10"/>
         </w:numPr>
         <w:spacing w:line="240" w:lineRule="auto"/>
         <w:ind w:left="2160" w:hanging="360"/>
@@ -2666,7 +2666,7 @@
       <w:pPr>
         <w:numPr>
           <w:ilvl w:val="2"/>
-          <w:numId w:val="11"/>
+          <w:numId w:val="10"/>
         </w:numPr>
         <w:spacing w:line="240" w:lineRule="auto"/>
         <w:ind w:left="2160" w:hanging="360"/>
@@ -2709,7 +2709,7 @@
       <w:pPr>
         <w:numPr>
           <w:ilvl w:val="2"/>
-          <w:numId w:val="11"/>
+          <w:numId w:val="10"/>
         </w:numPr>
         <w:spacing w:line="240" w:lineRule="auto"/>
         <w:ind w:left="2160" w:hanging="360"/>
@@ -2756,7 +2756,7 @@
       <w:pPr>
         <w:numPr>
           <w:ilvl w:val="1"/>
-          <w:numId w:val="11"/>
+          <w:numId w:val="10"/>
         </w:numPr>
         <w:spacing w:line="240" w:lineRule="auto"/>
         <w:ind w:left="1440" w:hanging="360"/>
@@ -2781,7 +2781,7 @@
       <w:pPr>
         <w:numPr>
           <w:ilvl w:val="2"/>
-          <w:numId w:val="11"/>
+          <w:numId w:val="10"/>
         </w:numPr>
         <w:spacing w:line="240" w:lineRule="auto"/>
         <w:ind w:left="2160" w:hanging="360"/>
@@ -2806,7 +2806,7 @@
       <w:pPr>
         <w:numPr>
           <w:ilvl w:val="2"/>
-          <w:numId w:val="11"/>
+          <w:numId w:val="10"/>
         </w:numPr>
         <w:spacing w:line="240" w:lineRule="auto"/>
         <w:ind w:left="2160" w:hanging="360"/>
@@ -2831,7 +2831,7 @@
       <w:pPr>
         <w:numPr>
           <w:ilvl w:val="1"/>
-          <w:numId w:val="11"/>
+          <w:numId w:val="10"/>
         </w:numPr>
         <w:spacing w:line="240" w:lineRule="auto"/>
         <w:ind w:left="1440" w:hanging="360"/>
@@ -2856,7 +2856,7 @@
       <w:pPr>
         <w:numPr>
           <w:ilvl w:val="1"/>
-          <w:numId w:val="11"/>
+          <w:numId w:val="10"/>
         </w:numPr>
         <w:spacing w:line="240" w:lineRule="auto"/>
         <w:ind w:left="1440" w:hanging="360"/>
@@ -2881,7 +2881,7 @@
       <w:pPr>
         <w:numPr>
           <w:ilvl w:val="1"/>
-          <w:numId w:val="11"/>
+          <w:numId w:val="10"/>
         </w:numPr>
         <w:spacing w:line="240" w:lineRule="auto"/>
         <w:ind w:left="1440" w:hanging="360"/>
@@ -2906,7 +2906,7 @@
       <w:pPr>
         <w:numPr>
           <w:ilvl w:val="0"/>
-          <w:numId w:val="11"/>
+          <w:numId w:val="10"/>
         </w:numPr>
         <w:spacing w:line="240" w:lineRule="auto"/>
         <w:ind w:left="720" w:hanging="360"/>
@@ -2936,7 +2936,7 @@
       <w:pPr>
         <w:numPr>
           <w:ilvl w:val="0"/>
-          <w:numId w:val="11"/>
+          <w:numId w:val="10"/>
         </w:numPr>
         <w:spacing w:line="240" w:lineRule="auto"/>
         <w:ind w:left="720" w:hanging="360"/>
@@ -2961,7 +2961,7 @@
       <w:pPr>
         <w:numPr>
           <w:ilvl w:val="1"/>
-          <w:numId w:val="11"/>
+          <w:numId w:val="10"/>
         </w:numPr>
         <w:spacing w:line="240" w:lineRule="auto"/>
         <w:ind w:left="1440" w:hanging="360"/>
@@ -2986,7 +2986,7 @@
       <w:pPr>
         <w:numPr>
           <w:ilvl w:val="2"/>
-          <w:numId w:val="11"/>
+          <w:numId w:val="10"/>
         </w:numPr>
         <w:spacing w:line="240" w:lineRule="auto"/>
         <w:ind w:left="2160" w:hanging="360"/>
@@ -3020,7 +3020,7 @@
       <w:pPr>
         <w:numPr>
           <w:ilvl w:val="2"/>
-          <w:numId w:val="11"/>
+          <w:numId w:val="10"/>
         </w:numPr>
         <w:spacing w:line="240" w:lineRule="auto"/>
         <w:ind w:left="2160" w:hanging="360"/>
@@ -3050,7 +3050,7 @@
       <w:pPr>
         <w:numPr>
           <w:ilvl w:val="1"/>
-          <w:numId w:val="11"/>
+          <w:numId w:val="10"/>
         </w:numPr>
         <w:spacing w:line="240" w:lineRule="auto"/>
         <w:ind w:left="1440" w:hanging="360"/>
@@ -3075,7 +3075,7 @@
       <w:pPr>
         <w:numPr>
           <w:ilvl w:val="2"/>
-          <w:numId w:val="11"/>
+          <w:numId w:val="10"/>
         </w:numPr>
         <w:spacing w:line="240" w:lineRule="auto"/>
         <w:ind w:left="2160" w:hanging="360"/>
@@ -3100,7 +3100,7 @@
       <w:pPr>
         <w:numPr>
           <w:ilvl w:val="1"/>
-          <w:numId w:val="11"/>
+          <w:numId w:val="10"/>
         </w:numPr>
         <w:spacing w:line="240" w:lineRule="auto"/>
         <w:ind w:left="1440" w:hanging="360"/>
@@ -3125,7 +3125,7 @@
       <w:pPr>
         <w:numPr>
           <w:ilvl w:val="1"/>
-          <w:numId w:val="11"/>
+          <w:numId w:val="10"/>
         </w:numPr>
         <w:spacing w:line="240" w:lineRule="auto"/>
         <w:ind w:left="1440" w:hanging="360"/>
@@ -3150,7 +3150,7 @@
       <w:pPr>
         <w:numPr>
           <w:ilvl w:val="1"/>
-          <w:numId w:val="11"/>
+          <w:numId w:val="10"/>
         </w:numPr>
         <w:spacing w:line="240" w:lineRule="auto"/>
         <w:ind w:left="1440" w:hanging="360"/>
@@ -3178,7 +3178,7 @@
       <w:pPr>
         <w:numPr>
           <w:ilvl w:val="0"/>
-          <w:numId w:val="11"/>
+          <w:numId w:val="10"/>
         </w:numPr>
         <w:spacing w:line="240" w:lineRule="auto"/>
         <w:ind w:left="720" w:hanging="360"/>
@@ -3203,7 +3203,7 @@
       <w:pPr>
         <w:numPr>
           <w:ilvl w:val="1"/>
-          <w:numId w:val="11"/>
+          <w:numId w:val="10"/>
         </w:numPr>
         <w:spacing w:line="240" w:lineRule="auto"/>
         <w:ind w:left="1440" w:hanging="360"/>
@@ -3228,7 +3228,7 @@
       <w:pPr>
         <w:numPr>
           <w:ilvl w:val="2"/>
-          <w:numId w:val="11"/>
+          <w:numId w:val="10"/>
         </w:numPr>
         <w:spacing w:line="240" w:lineRule="auto"/>
         <w:ind w:left="2160" w:hanging="360"/>
@@ -3262,7 +3262,7 @@
       <w:pPr>
         <w:numPr>
           <w:ilvl w:val="2"/>
-          <w:numId w:val="11"/>
+          <w:numId w:val="10"/>
         </w:numPr>
         <w:spacing w:line="240" w:lineRule="auto"/>
         <w:ind w:left="2160" w:hanging="360"/>
@@ -3297,7 +3297,7 @@
       <w:pPr>
         <w:numPr>
           <w:ilvl w:val="1"/>
-          <w:numId w:val="11"/>
+          <w:numId w:val="10"/>
         </w:numPr>
         <w:spacing w:line="240" w:lineRule="auto"/>
         <w:ind w:left="1440" w:hanging="360"/>
@@ -3322,7 +3322,7 @@
       <w:pPr>
         <w:numPr>
           <w:ilvl w:val="2"/>
-          <w:numId w:val="11"/>
+          <w:numId w:val="10"/>
         </w:numPr>
         <w:spacing w:line="240" w:lineRule="auto"/>
         <w:ind w:left="2160" w:hanging="360"/>
@@ -3347,7 +3347,7 @@
       <w:pPr>
         <w:numPr>
           <w:ilvl w:val="2"/>
-          <w:numId w:val="11"/>
+          <w:numId w:val="10"/>
         </w:numPr>
         <w:spacing w:line="240" w:lineRule="auto"/>
         <w:ind w:left="2160" w:hanging="360"/>
@@ -3372,7 +3372,7 @@
       <w:pPr>
         <w:numPr>
           <w:ilvl w:val="1"/>
-          <w:numId w:val="11"/>
+          <w:numId w:val="10"/>
         </w:numPr>
         <w:spacing w:line="240" w:lineRule="auto"/>
         <w:ind w:left="1440" w:hanging="360"/>
@@ -3397,7 +3397,7 @@
       <w:pPr>
         <w:numPr>
           <w:ilvl w:val="1"/>
-          <w:numId w:val="11"/>
+          <w:numId w:val="10"/>
         </w:numPr>
         <w:spacing w:line="240" w:lineRule="auto"/>
         <w:ind w:left="1440" w:hanging="360"/>
@@ -3422,7 +3422,7 @@
       <w:pPr>
         <w:numPr>
           <w:ilvl w:val="1"/>
-          <w:numId w:val="11"/>
+          <w:numId w:val="10"/>
         </w:numPr>
         <w:spacing w:line="240" w:lineRule="auto"/>
         <w:ind w:left="1440" w:hanging="360"/>
@@ -4438,14 +4438,14 @@
         </w:rPr>
         <w:drawing>
           <wp:inline distB="114300" distT="114300" distL="114300" distR="114300">
-            <wp:extent cx="5731200" cy="8051800"/>
+            <wp:extent cx="5731200" cy="7962900"/>
             <wp:effectExtent b="0" l="0" r="0" t="0"/>
-            <wp:docPr id="44" name="image2.png"/>
+            <wp:docPr id="38" name="image3.png"/>
             <a:graphic>
               <a:graphicData uri="http://schemas.openxmlformats.org/drawingml/2006/picture">
                 <pic:pic>
                   <pic:nvPicPr>
-                    <pic:cNvPr id="0" name="image2.png"/>
+                    <pic:cNvPr id="0" name="image3.png"/>
                     <pic:cNvPicPr preferRelativeResize="0"/>
                   </pic:nvPicPr>
                   <pic:blipFill>
@@ -4458,7 +4458,7 @@
                   <pic:spPr>
                     <a:xfrm>
                       <a:off x="0" y="0"/>
-                      <a:ext cx="5731200" cy="8051800"/>
+                      <a:ext cx="5731200" cy="7962900"/>
                     </a:xfrm>
                     <a:prstGeom prst="rect"/>
                     <a:ln/>
@@ -4521,14 +4521,14 @@
         </w:rPr>
         <w:drawing>
           <wp:inline distB="114300" distT="114300" distL="114300" distR="114300">
-            <wp:extent cx="5731200" cy="7861300"/>
+            <wp:extent cx="5667375" cy="8191500"/>
             <wp:effectExtent b="0" l="0" r="0" t="0"/>
-            <wp:docPr id="50" name="image6.png"/>
+            <wp:docPr id="49" name="image19.png"/>
             <a:graphic>
               <a:graphicData uri="http://schemas.openxmlformats.org/drawingml/2006/picture">
                 <pic:pic>
                   <pic:nvPicPr>
-                    <pic:cNvPr id="0" name="image6.png"/>
+                    <pic:cNvPr id="0" name="image19.png"/>
                     <pic:cNvPicPr preferRelativeResize="0"/>
                   </pic:nvPicPr>
                   <pic:blipFill>
@@ -4541,7 +4541,7 @@
                   <pic:spPr>
                     <a:xfrm>
                       <a:off x="0" y="0"/>
-                      <a:ext cx="5731200" cy="7861300"/>
+                      <a:ext cx="5667375" cy="8191500"/>
                     </a:xfrm>
                     <a:prstGeom prst="rect"/>
                     <a:ln/>
@@ -4621,14 +4621,14 @@
         </w:rPr>
         <w:drawing>
           <wp:inline distB="114300" distT="114300" distL="114300" distR="114300">
-            <wp:extent cx="5731200" cy="4394200"/>
+            <wp:extent cx="5731200" cy="7823200"/>
             <wp:effectExtent b="0" l="0" r="0" t="0"/>
-            <wp:docPr id="31" name="image1.png"/>
+            <wp:docPr id="43" name="image14.png"/>
             <a:graphic>
               <a:graphicData uri="http://schemas.openxmlformats.org/drawingml/2006/picture">
                 <pic:pic>
                   <pic:nvPicPr>
-                    <pic:cNvPr id="0" name="image1.png"/>
+                    <pic:cNvPr id="0" name="image14.png"/>
                     <pic:cNvPicPr preferRelativeResize="0"/>
                   </pic:nvPicPr>
                   <pic:blipFill>
@@ -4641,7 +4641,7 @@
                   <pic:spPr>
                     <a:xfrm>
                       <a:off x="0" y="0"/>
-                      <a:ext cx="5731200" cy="4394200"/>
+                      <a:ext cx="5731200" cy="7823200"/>
                     </a:xfrm>
                     <a:prstGeom prst="rect"/>
                     <a:ln/>
@@ -4673,77 +4673,17 @@
         </w:rPr>
         <w:br w:type="textWrapping"/>
         <w:t xml:space="preserve">Планований час на реалізацію: 1:30 години</w:t>
-      </w:r>
-    </w:p>
-    <w:p>
-      <w:pPr>
-        <w:spacing w:line="240" w:lineRule="auto"/>
-        <w:ind w:left="720" w:firstLine="0"/>
-        <w:jc w:val="both"/>
-        <w:rPr>
-          <w:rFonts w:ascii="Times New Roman" w:cs="Times New Roman" w:eastAsia="Times New Roman" w:hAnsi="Times New Roman"/>
-          <w:sz w:val="24"/>
-          <w:szCs w:val="24"/>
-        </w:rPr>
-      </w:pPr>
-      <w:r>
-        <w:rPr>
-          <w:rtl w:val="0"/>
-        </w:rPr>
-      </w:r>
-    </w:p>
-    <w:p>
-      <w:pPr>
-        <w:spacing w:line="240" w:lineRule="auto"/>
-        <w:jc w:val="both"/>
-        <w:rPr>
-          <w:rFonts w:ascii="Times New Roman" w:cs="Times New Roman" w:eastAsia="Times New Roman" w:hAnsi="Times New Roman"/>
-          <w:sz w:val="24"/>
-          <w:szCs w:val="24"/>
-        </w:rPr>
-      </w:pPr>
-      <w:r>
-        <w:rPr>
-          <w:rtl w:val="0"/>
-        </w:rPr>
-      </w:r>
-    </w:p>
-    <w:p>
-      <w:pPr>
-        <w:spacing w:line="240" w:lineRule="auto"/>
-        <w:jc w:val="both"/>
-        <w:rPr>
-          <w:rFonts w:ascii="Times New Roman" w:cs="Times New Roman" w:eastAsia="Times New Roman" w:hAnsi="Times New Roman"/>
-          <w:sz w:val="24"/>
-          <w:szCs w:val="24"/>
-        </w:rPr>
-      </w:pPr>
-      <w:r>
-        <w:rPr>
-          <w:rtl w:val="0"/>
-        </w:rPr>
-      </w:r>
-    </w:p>
-    <w:p>
-      <w:pPr>
-        <w:pStyle w:val="Heading2"/>
-        <w:spacing w:after="0" w:before="40" w:line="276" w:lineRule="auto"/>
-        <w:jc w:val="both"/>
+        <w:br w:type="textWrapping"/>
+        <w:br w:type="textWrapping"/>
+        <w:br w:type="textWrapping"/>
+      </w:r>
+      <w:r>
         <w:rPr>
           <w:rFonts w:ascii="Times New Roman" w:cs="Times New Roman" w:eastAsia="Times New Roman" w:hAnsi="Times New Roman"/>
           <w:b w:val="1"/>
           <w:bCs w:val="1"/>
           <w:sz w:val="26"/>
           <w:szCs w:val="26"/>
-        </w:rPr>
-      </w:pPr>
-      <w:r>
-        <w:rPr>
-          <w:rFonts w:ascii="Times New Roman" w:cs="Times New Roman" w:eastAsia="Times New Roman" w:hAnsi="Times New Roman"/>
-          <w:b w:val="1"/>
-          <w:bCs w:val="1"/>
-          <w:sz w:val="26"/>
-          <w:szCs w:val="26"/>
           <w:rtl w:val="0"/>
         </w:rPr>
         <w:t xml:space="preserve">3.</w:t>
@@ -4777,30 +4717,8 @@
     </w:p>
     <w:p>
       <w:pPr>
-        <w:spacing w:line="276" w:lineRule="auto"/>
-        <w:jc w:val="both"/>
-        <w:rPr>
-          <w:rFonts w:ascii="Times New Roman" w:cs="Times New Roman" w:eastAsia="Times New Roman" w:hAnsi="Times New Roman"/>
-          <w:b w:val="1"/>
-          <w:bCs w:val="1"/>
-          <w:sz w:val="24"/>
-          <w:szCs w:val="24"/>
-        </w:rPr>
-      </w:pPr>
-      <w:r>
-        <w:rPr>
-          <w:rtl w:val="0"/>
-        </w:rPr>
-      </w:r>
-    </w:p>
-    <w:p>
-      <w:pPr>
-        <w:numPr>
-          <w:ilvl w:val="0"/>
-          <w:numId w:val="10"/>
-        </w:numPr>
         <w:spacing w:after="160" w:line="256.7994545454545" w:lineRule="auto"/>
-        <w:ind w:left="720" w:hanging="360"/>
+        <w:ind w:left="0" w:firstLine="0"/>
         <w:jc w:val="both"/>
         <w:rPr>
           <w:rFonts w:ascii="Times New Roman" w:cs="Times New Roman" w:eastAsia="Times New Roman" w:hAnsi="Times New Roman"/>
@@ -4853,6 +4771,15 @@
       </w:hyperlink>
       <w:r>
         <w:rPr>
+          <w:rFonts w:ascii="Times New Roman" w:cs="Times New Roman" w:eastAsia="Times New Roman" w:hAnsi="Times New Roman"/>
+          <w:sz w:val="24"/>
+          <w:szCs w:val="24"/>
+          <w:rtl w:val="0"/>
+        </w:rPr>
+        <w:br w:type="textWrapping"/>
+      </w:r>
+      <w:r>
+        <w:rPr>
           <w:rtl w:val="0"/>
         </w:rPr>
       </w:r>
@@ -4906,26 +4833,17 @@
           <w:rFonts w:ascii="Times New Roman" w:cs="Times New Roman" w:eastAsia="Times New Roman" w:hAnsi="Times New Roman"/>
           <w:sz w:val="24"/>
           <w:szCs w:val="24"/>
-          <w:rtl w:val="0"/>
-        </w:rPr>
-        <w:br w:type="textWrapping"/>
-      </w:r>
-      <w:r>
-        <w:rPr>
-          <w:rFonts w:ascii="Times New Roman" w:cs="Times New Roman" w:eastAsia="Times New Roman" w:hAnsi="Times New Roman"/>
-          <w:sz w:val="24"/>
-          <w:szCs w:val="24"/>
         </w:rPr>
         <w:drawing>
           <wp:inline distB="114300" distT="114300" distL="114300" distR="114300">
-            <wp:extent cx="5731200" cy="8051800"/>
+            <wp:extent cx="5731200" cy="7962900"/>
             <wp:effectExtent b="0" l="0" r="0" t="0"/>
-            <wp:docPr id="32" name="image2.png"/>
+            <wp:docPr id="50" name="image4.png"/>
             <a:graphic>
               <a:graphicData uri="http://schemas.openxmlformats.org/drawingml/2006/picture">
                 <pic:pic>
                   <pic:nvPicPr>
-                    <pic:cNvPr id="0" name="image2.png"/>
+                    <pic:cNvPr id="0" name="image4.png"/>
                     <pic:cNvPicPr preferRelativeResize="0"/>
                   </pic:nvPicPr>
                   <pic:blipFill>
@@ -4938,7 +4856,7 @@
                   <pic:spPr>
                     <a:xfrm>
                       <a:off x="0" y="0"/>
-                      <a:ext cx="5731200" cy="8051800"/>
+                      <a:ext cx="5731200" cy="7962900"/>
                     </a:xfrm>
                     <a:prstGeom prst="rect"/>
                     <a:ln/>
@@ -4951,6 +4869,15 @@
       </w:r>
       <w:r>
         <w:rPr>
+          <w:rFonts w:ascii="Times New Roman" w:cs="Times New Roman" w:eastAsia="Times New Roman" w:hAnsi="Times New Roman"/>
+          <w:sz w:val="24"/>
+          <w:szCs w:val="24"/>
+          <w:rtl w:val="0"/>
+        </w:rPr>
+        <w:br w:type="textWrapping"/>
+      </w:r>
+      <w:r>
+        <w:rPr>
           <w:rtl w:val="0"/>
         </w:rPr>
       </w:r>
@@ -4975,14 +4902,14 @@
         </w:rPr>
         <w:drawing>
           <wp:inline distB="114300" distT="114300" distL="114300" distR="114300">
-            <wp:extent cx="5731200" cy="7861300"/>
+            <wp:extent cx="5667375" cy="8191500"/>
             <wp:effectExtent b="0" l="0" r="0" t="0"/>
-            <wp:docPr id="34" name="image6.png"/>
+            <wp:docPr id="47" name="image20.png"/>
             <a:graphic>
               <a:graphicData uri="http://schemas.openxmlformats.org/drawingml/2006/picture">
                 <pic:pic>
                   <pic:nvPicPr>
-                    <pic:cNvPr id="0" name="image6.png"/>
+                    <pic:cNvPr id="0" name="image20.png"/>
                     <pic:cNvPicPr preferRelativeResize="0"/>
                   </pic:nvPicPr>
                   <pic:blipFill>
@@ -4995,7 +4922,7 @@
                   <pic:spPr>
                     <a:xfrm>
                       <a:off x="0" y="0"/>
-                      <a:ext cx="5731200" cy="7861300"/>
+                      <a:ext cx="5667375" cy="8191500"/>
                     </a:xfrm>
                     <a:prstGeom prst="rect"/>
                     <a:ln/>
@@ -5028,14 +4955,14 @@
         </w:rPr>
         <w:drawing>
           <wp:inline distB="114300" distT="114300" distL="114300" distR="114300">
-            <wp:extent cx="5731200" cy="4394200"/>
+            <wp:extent cx="5731200" cy="7823200"/>
             <wp:effectExtent b="0" l="0" r="0" t="0"/>
-            <wp:docPr id="35" name="image1.png"/>
+            <wp:docPr id="33" name="image15.png"/>
             <a:graphic>
               <a:graphicData uri="http://schemas.openxmlformats.org/drawingml/2006/picture">
                 <pic:pic>
                   <pic:nvPicPr>
-                    <pic:cNvPr id="0" name="image1.png"/>
+                    <pic:cNvPr id="0" name="image15.png"/>
                     <pic:cNvPicPr preferRelativeResize="0"/>
                   </pic:nvPicPr>
                   <pic:blipFill>
@@ -5048,7 +4975,7 @@
                   <pic:spPr>
                     <a:xfrm>
                       <a:off x="0" y="0"/>
-                      <a:ext cx="5731200" cy="4394200"/>
+                      <a:ext cx="5731200" cy="7823200"/>
                     </a:xfrm>
                     <a:prstGeom prst="rect"/>
                     <a:ln/>
@@ -5093,6 +5020,9 @@
         </w:rPr>
         <w:br w:type="textWrapping"/>
         <w:br w:type="textWrapping"/>
+        <w:br w:type="textWrapping"/>
+        <w:br w:type="textWrapping"/>
+        <w:br w:type="textWrapping"/>
         <w:t xml:space="preserve">Завдання №3 Configuration: Trellо</w:t>
       </w:r>
     </w:p>
@@ -5141,12 +5071,12 @@
           <wp:inline distB="114300" distT="114300" distL="114300" distR="114300">
             <wp:extent cx="5731200" cy="2794000"/>
             <wp:effectExtent b="0" l="0" r="0" t="0"/>
-            <wp:docPr id="45" name="image15.png"/>
+            <wp:docPr id="42" name="image17.png"/>
             <a:graphic>
               <a:graphicData uri="http://schemas.openxmlformats.org/drawingml/2006/picture">
                 <pic:pic>
                   <pic:nvPicPr>
-                    <pic:cNvPr id="0" name="image15.png"/>
+                    <pic:cNvPr id="0" name="image17.png"/>
                     <pic:cNvPicPr preferRelativeResize="0"/>
                   </pic:nvPicPr>
                   <pic:blipFill>
@@ -5272,7 +5202,7 @@
       <w:pPr>
         <w:numPr>
           <w:ilvl w:val="0"/>
-          <w:numId w:val="13"/>
+          <w:numId w:val="12"/>
         </w:numPr>
         <w:spacing w:after="200" w:line="276" w:lineRule="auto"/>
         <w:ind w:left="720" w:hanging="360"/>
@@ -5313,12 +5243,12 @@
           <wp:inline distB="114300" distT="114300" distL="114300" distR="114300">
             <wp:extent cx="5731200" cy="3467100"/>
             <wp:effectExtent b="0" l="0" r="0" t="0"/>
-            <wp:docPr id="41" name="image13.png"/>
+            <wp:docPr id="39" name="image9.png"/>
             <a:graphic>
               <a:graphicData uri="http://schemas.openxmlformats.org/drawingml/2006/picture">
                 <pic:pic>
                   <pic:nvPicPr>
-                    <pic:cNvPr id="0" name="image13.png"/>
+                    <pic:cNvPr id="0" name="image9.png"/>
                     <pic:cNvPicPr preferRelativeResize="0"/>
                   </pic:nvPicPr>
                   <pic:blipFill>
@@ -5463,12 +5393,12 @@
           <wp:inline distB="114300" distT="114300" distL="114300" distR="114300">
             <wp:extent cx="5731200" cy="2286000"/>
             <wp:effectExtent b="0" l="0" r="0" t="0"/>
-            <wp:docPr id="38" name="image3.png"/>
+            <wp:docPr id="35" name="image10.png"/>
             <a:graphic>
               <a:graphicData uri="http://schemas.openxmlformats.org/drawingml/2006/picture">
                 <pic:pic>
                   <pic:nvPicPr>
-                    <pic:cNvPr id="0" name="image3.png"/>
+                    <pic:cNvPr id="0" name="image10.png"/>
                     <pic:cNvPicPr preferRelativeResize="0"/>
                   </pic:nvPicPr>
                   <pic:blipFill>
@@ -5653,12 +5583,12 @@
           <wp:inline distB="114300" distT="114300" distL="114300" distR="114300">
             <wp:extent cx="5731200" cy="3048000"/>
             <wp:effectExtent b="0" l="0" r="0" t="0"/>
-            <wp:docPr id="42" name="image10.png"/>
+            <wp:docPr id="40" name="image5.png"/>
             <a:graphic>
               <a:graphicData uri="http://schemas.openxmlformats.org/drawingml/2006/picture">
                 <pic:pic>
                   <pic:nvPicPr>
-                    <pic:cNvPr id="0" name="image10.png"/>
+                    <pic:cNvPr id="0" name="image5.png"/>
                     <pic:cNvPicPr preferRelativeResize="0"/>
                   </pic:nvPicPr>
                   <pic:blipFill>
@@ -5719,12 +5649,12 @@
           <wp:inline distB="114300" distT="114300" distL="114300" distR="114300">
             <wp:extent cx="5731200" cy="2806700"/>
             <wp:effectExtent b="0" l="0" r="0" t="0"/>
-            <wp:docPr id="51" name="image17.png"/>
+            <wp:docPr id="51" name="image11.png"/>
             <a:graphic>
               <a:graphicData uri="http://schemas.openxmlformats.org/drawingml/2006/picture">
                 <pic:pic>
                   <pic:nvPicPr>
-                    <pic:cNvPr id="0" name="image17.png"/>
+                    <pic:cNvPr id="0" name="image11.png"/>
                     <pic:cNvPicPr preferRelativeResize="0"/>
                   </pic:nvPicPr>
                   <pic:blipFill>
@@ -5876,7 +5806,7 @@
           <wp:inline distB="114300" distT="114300" distL="114300" distR="114300">
             <wp:extent cx="5731200" cy="749300"/>
             <wp:effectExtent b="0" l="0" r="0" t="0"/>
-            <wp:docPr id="48" name="image18.png"/>
+            <wp:docPr id="46" name="image18.png"/>
             <a:graphic>
               <a:graphicData uri="http://schemas.openxmlformats.org/drawingml/2006/picture">
                 <pic:pic>
@@ -6023,7 +5953,7 @@
       <w:pPr>
         <w:numPr>
           <w:ilvl w:val="0"/>
-          <w:numId w:val="12"/>
+          <w:numId w:val="11"/>
         </w:numPr>
         <w:spacing w:after="160" w:line="256.7994545454545" w:lineRule="auto"/>
         <w:ind w:left="720" w:hanging="360"/>
@@ -6064,12 +5994,12 @@
           <wp:inline distB="114300" distT="114300" distL="114300" distR="114300">
             <wp:extent cx="5731200" cy="2641600"/>
             <wp:effectExtent b="0" l="0" r="0" t="0"/>
-            <wp:docPr id="49" name="image8.png"/>
+            <wp:docPr id="48" name="image21.png"/>
             <a:graphic>
               <a:graphicData uri="http://schemas.openxmlformats.org/drawingml/2006/picture">
                 <pic:pic>
                   <pic:nvPicPr>
-                    <pic:cNvPr id="0" name="image8.png"/>
+                    <pic:cNvPr id="0" name="image21.png"/>
                     <pic:cNvPicPr preferRelativeResize="0"/>
                   </pic:nvPicPr>
                   <pic:blipFill>
@@ -6212,12 +6142,12 @@
           <wp:inline distB="114300" distT="114300" distL="114300" distR="114300">
             <wp:extent cx="4000500" cy="2650311"/>
             <wp:effectExtent b="0" l="0" r="0" t="0"/>
-            <wp:docPr id="33" name="image16.png"/>
+            <wp:docPr id="31" name="image6.png"/>
             <a:graphic>
               <a:graphicData uri="http://schemas.openxmlformats.org/drawingml/2006/picture">
                 <pic:pic>
                   <pic:nvPicPr>
-                    <pic:cNvPr id="0" name="image16.png"/>
+                    <pic:cNvPr id="0" name="image6.png"/>
                     <pic:cNvPicPr preferRelativeResize="0"/>
                   </pic:nvPicPr>
                   <pic:blipFill>
@@ -18309,12 +18239,12 @@
           <wp:inline distB="114300" distT="114300" distL="114300" distR="114300">
             <wp:extent cx="5731200" cy="3479800"/>
             <wp:effectExtent b="0" l="0" r="0" t="0"/>
-            <wp:docPr id="39" name="image12.png"/>
+            <wp:docPr id="36" name="image1.png"/>
             <a:graphic>
               <a:graphicData uri="http://schemas.openxmlformats.org/drawingml/2006/picture">
                 <pic:pic>
                   <pic:nvPicPr>
-                    <pic:cNvPr id="0" name="image12.png"/>
+                    <pic:cNvPr id="0" name="image1.png"/>
                     <pic:cNvPicPr preferRelativeResize="0"/>
                   </pic:nvPicPr>
                   <pic:blipFill>
@@ -18402,12 +18332,12 @@
           <wp:inline distB="114300" distT="114300" distL="114300" distR="114300">
             <wp:extent cx="5731200" cy="3632200"/>
             <wp:effectExtent b="0" l="0" r="0" t="0"/>
-            <wp:docPr id="40" name="image9.png"/>
+            <wp:docPr id="37" name="image7.png"/>
             <a:graphic>
               <a:graphicData uri="http://schemas.openxmlformats.org/drawingml/2006/picture">
                 <pic:pic>
                   <pic:nvPicPr>
-                    <pic:cNvPr id="0" name="image9.png"/>
+                    <pic:cNvPr id="0" name="image7.png"/>
                     <pic:cNvPicPr preferRelativeResize="0"/>
                   </pic:nvPicPr>
                   <pic:blipFill>
@@ -18478,12 +18408,12 @@
           <wp:inline distB="114300" distT="114300" distL="114300" distR="114300">
             <wp:extent cx="5731200" cy="3810000"/>
             <wp:effectExtent b="0" l="0" r="0" t="0"/>
-            <wp:docPr id="37" name="image5.png"/>
+            <wp:docPr id="34" name="image8.png"/>
             <a:graphic>
               <a:graphicData uri="http://schemas.openxmlformats.org/drawingml/2006/picture">
                 <pic:pic>
                   <pic:nvPicPr>
-                    <pic:cNvPr id="0" name="image5.png"/>
+                    <pic:cNvPr id="0" name="image8.png"/>
                     <pic:cNvPicPr preferRelativeResize="0"/>
                   </pic:nvPicPr>
                   <pic:blipFill>
@@ -18733,12 +18663,12 @@
           <wp:inline distB="114300" distT="114300" distL="114300" distR="114300">
             <wp:extent cx="5731200" cy="2692400"/>
             <wp:effectExtent b="0" l="0" r="0" t="0"/>
-            <wp:docPr id="43" name="image14.png"/>
+            <wp:docPr id="41" name="image12.png"/>
             <a:graphic>
               <a:graphicData uri="http://schemas.openxmlformats.org/drawingml/2006/picture">
                 <pic:pic>
                   <pic:nvPicPr>
-                    <pic:cNvPr id="0" name="image14.png"/>
+                    <pic:cNvPr id="0" name="image12.png"/>
                     <pic:cNvPicPr preferRelativeResize="0"/>
                   </pic:nvPicPr>
                   <pic:blipFill>
@@ -18867,12 +18797,12 @@
           <wp:inline distB="114300" distT="114300" distL="114300" distR="114300">
             <wp:extent cx="5731200" cy="3225800"/>
             <wp:effectExtent b="0" l="0" r="0" t="0"/>
-            <wp:docPr id="36" name="image11.png"/>
+            <wp:docPr id="32" name="image16.png"/>
             <a:graphic>
               <a:graphicData uri="http://schemas.openxmlformats.org/drawingml/2006/picture">
                 <pic:pic>
                   <pic:nvPicPr>
-                    <pic:cNvPr id="0" name="image11.png"/>
+                    <pic:cNvPr id="0" name="image16.png"/>
                     <pic:cNvPicPr preferRelativeResize="0"/>
                   </pic:nvPicPr>
                   <pic:blipFill>
@@ -18979,12 +18909,12 @@
           <wp:inline distB="114300" distT="114300" distL="114300" distR="114300">
             <wp:extent cx="5731200" cy="2286000"/>
             <wp:effectExtent b="0" l="0" r="0" t="0"/>
-            <wp:docPr id="47" name="image7.png"/>
+            <wp:docPr id="45" name="image13.png"/>
             <a:graphic>
               <a:graphicData uri="http://schemas.openxmlformats.org/drawingml/2006/picture">
                 <pic:pic>
                   <pic:nvPicPr>
-                    <pic:cNvPr id="0" name="image7.png"/>
+                    <pic:cNvPr id="0" name="image13.png"/>
                     <pic:cNvPicPr preferRelativeResize="0"/>
                   </pic:nvPicPr>
                   <pic:blipFill>
@@ -20517,7 +20447,7 @@
     <w:lvl w:ilvl="1">
       <w:start w:val="1"/>
       <w:numFmt w:val="bullet"/>
-      <w:lvlText w:val="-"/>
+      <w:lvlText w:val="o"/>
       <w:lvlJc w:val="left"/>
       <w:pPr>
         <w:ind w:left="1440" w:hanging="360"/>
@@ -20529,7 +20459,7 @@
     <w:lvl w:ilvl="2">
       <w:start w:val="1"/>
       <w:numFmt w:val="bullet"/>
-      <w:lvlText w:val="-"/>
+      <w:lvlText w:val="▪"/>
       <w:lvlJc w:val="left"/>
       <w:pPr>
         <w:ind w:left="2160" w:hanging="360"/>
@@ -20541,7 +20471,7 @@
     <w:lvl w:ilvl="3">
       <w:start w:val="1"/>
       <w:numFmt w:val="bullet"/>
-      <w:lvlText w:val="-"/>
+      <w:lvlText w:val="●"/>
       <w:lvlJc w:val="left"/>
       <w:pPr>
         <w:ind w:left="2880" w:hanging="360"/>
@@ -20553,7 +20483,7 @@
     <w:lvl w:ilvl="4">
       <w:start w:val="1"/>
       <w:numFmt w:val="bullet"/>
-      <w:lvlText w:val="-"/>
+      <w:lvlText w:val="o"/>
       <w:lvlJc w:val="left"/>
       <w:pPr>
         <w:ind w:left="3600" w:hanging="360"/>
@@ -20565,7 +20495,7 @@
     <w:lvl w:ilvl="5">
       <w:start w:val="1"/>
       <w:numFmt w:val="bullet"/>
-      <w:lvlText w:val="-"/>
+      <w:lvlText w:val="▪"/>
       <w:lvlJc w:val="left"/>
       <w:pPr>
         <w:ind w:left="4320" w:hanging="360"/>
@@ -20577,7 +20507,7 @@
     <w:lvl w:ilvl="6">
       <w:start w:val="1"/>
       <w:numFmt w:val="bullet"/>
-      <w:lvlText w:val="-"/>
+      <w:lvlText w:val="●"/>
       <w:lvlJc w:val="left"/>
       <w:pPr>
         <w:ind w:left="5040" w:hanging="360"/>
@@ -20589,7 +20519,7 @@
     <w:lvl w:ilvl="7">
       <w:start w:val="1"/>
       <w:numFmt w:val="bullet"/>
-      <w:lvlText w:val="-"/>
+      <w:lvlText w:val="o"/>
       <w:lvlJc w:val="left"/>
       <w:pPr>
         <w:ind w:left="5760" w:hanging="360"/>
@@ -20601,7 +20531,7 @@
     <w:lvl w:ilvl="8">
       <w:start w:val="1"/>
       <w:numFmt w:val="bullet"/>
-      <w:lvlText w:val="-"/>
+      <w:lvlText w:val="▪"/>
       <w:lvlJc w:val="left"/>
       <w:pPr>
         <w:ind w:left="6480" w:hanging="360"/>
@@ -20627,7 +20557,7 @@
     <w:lvl w:ilvl="1">
       <w:start w:val="1"/>
       <w:numFmt w:val="bullet"/>
-      <w:lvlText w:val="o"/>
+      <w:lvlText w:val="-"/>
       <w:lvlJc w:val="left"/>
       <w:pPr>
         <w:ind w:left="1440" w:hanging="360"/>
@@ -20639,7 +20569,7 @@
     <w:lvl w:ilvl="2">
       <w:start w:val="1"/>
       <w:numFmt w:val="bullet"/>
-      <w:lvlText w:val="▪"/>
+      <w:lvlText w:val="-"/>
       <w:lvlJc w:val="left"/>
       <w:pPr>
         <w:ind w:left="2160" w:hanging="360"/>
@@ -20651,7 +20581,7 @@
     <w:lvl w:ilvl="3">
       <w:start w:val="1"/>
       <w:numFmt w:val="bullet"/>
-      <w:lvlText w:val="●"/>
+      <w:lvlText w:val="-"/>
       <w:lvlJc w:val="left"/>
       <w:pPr>
         <w:ind w:left="2880" w:hanging="360"/>
@@ -20663,7 +20593,7 @@
     <w:lvl w:ilvl="4">
       <w:start w:val="1"/>
       <w:numFmt w:val="bullet"/>
-      <w:lvlText w:val="o"/>
+      <w:lvlText w:val="-"/>
       <w:lvlJc w:val="left"/>
       <w:pPr>
         <w:ind w:left="3600" w:hanging="360"/>
@@ -20675,7 +20605,7 @@
     <w:lvl w:ilvl="5">
       <w:start w:val="1"/>
       <w:numFmt w:val="bullet"/>
-      <w:lvlText w:val="▪"/>
+      <w:lvlText w:val="-"/>
       <w:lvlJc w:val="left"/>
       <w:pPr>
         <w:ind w:left="4320" w:hanging="360"/>
@@ -20687,7 +20617,7 @@
     <w:lvl w:ilvl="6">
       <w:start w:val="1"/>
       <w:numFmt w:val="bullet"/>
-      <w:lvlText w:val="●"/>
+      <w:lvlText w:val="-"/>
       <w:lvlJc w:val="left"/>
       <w:pPr>
         <w:ind w:left="5040" w:hanging="360"/>
@@ -20699,7 +20629,7 @@
     <w:lvl w:ilvl="7">
       <w:start w:val="1"/>
       <w:numFmt w:val="bullet"/>
-      <w:lvlText w:val="o"/>
+      <w:lvlText w:val="-"/>
       <w:lvlJc w:val="left"/>
       <w:pPr>
         <w:ind w:left="5760" w:hanging="360"/>
@@ -20711,7 +20641,7 @@
     <w:lvl w:ilvl="8">
       <w:start w:val="1"/>
       <w:numFmt w:val="bullet"/>
-      <w:lvlText w:val="▪"/>
+      <w:lvlText w:val="-"/>
       <w:lvlJc w:val="left"/>
       <w:pPr>
         <w:ind w:left="6480" w:hanging="360"/>
@@ -20832,116 +20762,6 @@
     </w:lvl>
   </w:abstractNum>
   <w:abstractNum w:abstractNumId="13">
-    <w:lvl w:ilvl="0">
-      <w:start w:val="1"/>
-      <w:numFmt w:val="bullet"/>
-      <w:lvlText w:val="-"/>
-      <w:lvlJc w:val="left"/>
-      <w:pPr>
-        <w:ind w:left="720" w:hanging="360"/>
-      </w:pPr>
-      <w:rPr>
-        <w:u w:val="none"/>
-      </w:rPr>
-    </w:lvl>
-    <w:lvl w:ilvl="1">
-      <w:start w:val="1"/>
-      <w:numFmt w:val="bullet"/>
-      <w:lvlText w:val="-"/>
-      <w:lvlJc w:val="left"/>
-      <w:pPr>
-        <w:ind w:left="1440" w:hanging="360"/>
-      </w:pPr>
-      <w:rPr>
-        <w:u w:val="none"/>
-      </w:rPr>
-    </w:lvl>
-    <w:lvl w:ilvl="2">
-      <w:start w:val="1"/>
-      <w:numFmt w:val="bullet"/>
-      <w:lvlText w:val="-"/>
-      <w:lvlJc w:val="left"/>
-      <w:pPr>
-        <w:ind w:left="2160" w:hanging="360"/>
-      </w:pPr>
-      <w:rPr>
-        <w:u w:val="none"/>
-      </w:rPr>
-    </w:lvl>
-    <w:lvl w:ilvl="3">
-      <w:start w:val="1"/>
-      <w:numFmt w:val="bullet"/>
-      <w:lvlText w:val="-"/>
-      <w:lvlJc w:val="left"/>
-      <w:pPr>
-        <w:ind w:left="2880" w:hanging="360"/>
-      </w:pPr>
-      <w:rPr>
-        <w:u w:val="none"/>
-      </w:rPr>
-    </w:lvl>
-    <w:lvl w:ilvl="4">
-      <w:start w:val="1"/>
-      <w:numFmt w:val="bullet"/>
-      <w:lvlText w:val="-"/>
-      <w:lvlJc w:val="left"/>
-      <w:pPr>
-        <w:ind w:left="3600" w:hanging="360"/>
-      </w:pPr>
-      <w:rPr>
-        <w:u w:val="none"/>
-      </w:rPr>
-    </w:lvl>
-    <w:lvl w:ilvl="5">
-      <w:start w:val="1"/>
-      <w:numFmt w:val="bullet"/>
-      <w:lvlText w:val="-"/>
-      <w:lvlJc w:val="left"/>
-      <w:pPr>
-        <w:ind w:left="4320" w:hanging="360"/>
-      </w:pPr>
-      <w:rPr>
-        <w:u w:val="none"/>
-      </w:rPr>
-    </w:lvl>
-    <w:lvl w:ilvl="6">
-      <w:start w:val="1"/>
-      <w:numFmt w:val="bullet"/>
-      <w:lvlText w:val="-"/>
-      <w:lvlJc w:val="left"/>
-      <w:pPr>
-        <w:ind w:left="5040" w:hanging="360"/>
-      </w:pPr>
-      <w:rPr>
-        <w:u w:val="none"/>
-      </w:rPr>
-    </w:lvl>
-    <w:lvl w:ilvl="7">
-      <w:start w:val="1"/>
-      <w:numFmt w:val="bullet"/>
-      <w:lvlText w:val="-"/>
-      <w:lvlJc w:val="left"/>
-      <w:pPr>
-        <w:ind w:left="5760" w:hanging="360"/>
-      </w:pPr>
-      <w:rPr>
-        <w:u w:val="none"/>
-      </w:rPr>
-    </w:lvl>
-    <w:lvl w:ilvl="8">
-      <w:start w:val="1"/>
-      <w:numFmt w:val="bullet"/>
-      <w:lvlText w:val="-"/>
-      <w:lvlJc w:val="left"/>
-      <w:pPr>
-        <w:ind w:left="6480" w:hanging="360"/>
-      </w:pPr>
-      <w:rPr>
-        <w:u w:val="none"/>
-      </w:rPr>
-    </w:lvl>
-  </w:abstractNum>
-  <w:abstractNum w:abstractNumId="14">
     <w:lvl w:ilvl="0">
       <w:start w:val="1"/>
       <w:numFmt w:val="decimal"/>
@@ -21089,9 +20909,6 @@
   </w:num>
   <w:num w:numId="13">
     <w:abstractNumId w:val="13"/>
-  </w:num>
-  <w:num w:numId="14">
-    <w:abstractNumId w:val="14"/>
   </w:num>
 </w:numbering>
 </file>

</xml_diff>